<commit_message>
Fix lab 2 report pagination
</commit_message>
<xml_diff>
--- a/lab2/Юденко_Е.А._434701_Л2_ЖЦРПО.docx
+++ b/lab2/Юденко_Е.А._434701_Л2_ЖЦРПО.docx
@@ -700,7 +700,7 @@
       <w:r>
         <w:t>3.3 Fork репозитория</w:t>
         <w:tab/>
-        <w:t>8</w:t>
+        <w:t>7</w:t>
       </w:r>
     </w:p>
     <w:p>
@@ -714,7 +714,7 @@
       <w:r>
         <w:t>3.4 Выполнение операций с репозиторием в консоли</w:t>
         <w:tab/>
-        <w:t>8</w:t>
+        <w:t>7</w:t>
       </w:r>
     </w:p>
     <w:p>
@@ -728,7 +728,7 @@
       <w:r>
         <w:t>3.5 Создание ветки ProjectTemplate</w:t>
         <w:tab/>
-        <w:t>10</w:t>
+        <w:t>9</w:t>
       </w:r>
     </w:p>
     <w:p>
@@ -742,7 +742,7 @@
       <w:r>
         <w:t>4 ОТВЕТЫ НА КОНТРОЛЬНЫЕ ВОПРОСЫ</w:t>
         <w:tab/>
-        <w:t>11</w:t>
+        <w:t>10</w:t>
       </w:r>
     </w:p>
     <w:p>
@@ -756,7 +756,7 @@
       <w:r>
         <w:t>4.1 В чем преимущество Git перед SVN?</w:t>
         <w:tab/>
-        <w:t>11</w:t>
+        <w:t>10</w:t>
       </w:r>
     </w:p>
     <w:p>
@@ -770,7 +770,7 @@
       <w:r>
         <w:t>4.2 В чем преимущество распределенных репозиториев?</w:t>
         <w:tab/>
-        <w:t>11</w:t>
+        <w:t>10</w:t>
       </w:r>
     </w:p>
     <w:p>
@@ -784,7 +784,7 @@
       <w:r>
         <w:t>4.3 Граф типичной работы с веткой master в Git</w:t>
         <w:tab/>
-        <w:t>11</w:t>
+        <w:t>10</w:t>
       </w:r>
     </w:p>
     <w:p>
@@ -798,7 +798,7 @@
       <w:r>
         <w:t>4.4 Наиболее часто используемые команды</w:t>
         <w:tab/>
-        <w:t>12</w:t>
+        <w:t>11</w:t>
       </w:r>
     </w:p>
     <w:p>
@@ -812,7 +812,7 @@
       <w:r>
         <w:t>4.5 Что делать при изменениях в удаленном репозитории?</w:t>
         <w:tab/>
-        <w:t>12</w:t>
+        <w:t>11</w:t>
       </w:r>
     </w:p>
     <w:p>
@@ -826,7 +826,7 @@
       <w:r>
         <w:t>ЗАКЛЮЧЕНИЕ</w:t>
         <w:tab/>
-        <w:t>13</w:t>
+        <w:t>12</w:t>
       </w:r>
     </w:p>
     <w:p>
@@ -3314,7 +3314,7 @@
     <w:p>
       <w:pPr>
         <w:pStyle w:val="a3"/>
-        <w:keepNext/>
+        <w:keepNext w:val="0"/>
         <w:keepLines/>
         <w:widowControl/>
         <w:spacing w:lineRule="exact" w:line="360" w:before="0" w:after="360"/>
@@ -3465,7 +3465,7 @@
     <w:p>
       <w:pPr>
         <w:pStyle w:val="a3"/>
-        <w:keepNext/>
+        <w:keepNext w:val="0"/>
         <w:widowControl/>
         <w:spacing w:lineRule="exact" w:line="360" w:before="0" w:after="0"/>
         <w:ind w:left="0" w:right="162" w:firstLine="709"/>
@@ -3539,7 +3539,7 @@
     <w:p>
       <w:pPr>
         <w:pStyle w:val="a3"/>
-        <w:keepNext/>
+        <w:keepNext w:val="0"/>
         <w:keepLines/>
         <w:widowControl/>
         <w:spacing w:lineRule="exact" w:line="360" w:before="0" w:after="360"/>
@@ -3908,7 +3908,7 @@
     <w:p>
       <w:pPr>
         <w:pStyle w:val="a3"/>
-        <w:keepNext/>
+        <w:keepNext w:val="0"/>
         <w:keepLines/>
         <w:widowControl/>
         <w:spacing w:lineRule="exact" w:line="360" w:before="0" w:after="360"/>
@@ -4053,7 +4053,7 @@
     <w:p>
       <w:pPr>
         <w:pStyle w:val="a3"/>
-        <w:keepNext/>
+        <w:keepNext w:val="0"/>
         <w:keepLines/>
         <w:widowControl/>
         <w:spacing w:lineRule="exact" w:line="360" w:before="0" w:after="360"/>
@@ -4649,7 +4649,7 @@
     <w:p>
       <w:pPr>
         <w:pStyle w:val="a3"/>
-        <w:keepNext/>
+        <w:keepNext w:val="0"/>
         <w:keepLines/>
         <w:widowControl/>
         <w:spacing w:lineRule="exact" w:line="360" w:before="0" w:after="360"/>
@@ -5053,7 +5053,7 @@
     <w:p>
       <w:pPr>
         <w:pStyle w:val="a3"/>
-        <w:keepNext/>
+        <w:keepNext w:val="0"/>
         <w:keepLines/>
         <w:widowControl/>
         <w:spacing w:lineRule="exact" w:line="360" w:before="0" w:after="360"/>
@@ -5738,7 +5738,7 @@
     <w:p>
       <w:pPr>
         <w:pStyle w:val="a3"/>
-        <w:keepNext/>
+        <w:keepNext w:val="0"/>
         <w:keepLines/>
         <w:widowControl/>
         <w:spacing w:before="0" w:lineRule="exact" w:line="360" w:after="360"/>

</xml_diff>

<commit_message>
Start each lab report chapter on a new page
</commit_message>
<xml_diff>
--- a/lab2/Юденко_Е.А._434701_Л2_ЖЦРПО.docx
+++ b/lab2/Юденко_Е.А._434701_Л2_ЖЦРПО.docx
@@ -1605,7 +1605,7 @@
         <w:tabs>
           <w:tab w:val="left" w:pos="1055"/>
         </w:tabs>
-        <w:spacing w:lineRule="exact" w:line="360" w:before="0" w:after="360"/>
+        <w:spacing w:lineRule="exact" w:line="360" w:before="0" w:after="0"/>
         <w:ind w:left="0" w:firstLine="709"/>
         <w:jc w:val="left"/>
       </w:pPr>
@@ -3110,6 +3110,7 @@
         <w:pStyle w:val="1"/>
         <w:keepNext/>
         <w:keepLines/>
+        <w:pageBreakBefore/>
         <w:widowControl/>
         <w:numPr>
           <w:ilvl w:val="0"/>
@@ -3118,7 +3119,7 @@
         <w:tabs>
           <w:tab w:val="left" w:pos="1070"/>
         </w:tabs>
-        <w:spacing w:lineRule="exact" w:line="360" w:before="0" w:after="360"/>
+        <w:spacing w:lineRule="exact" w:line="360" w:before="0" w:after="0"/>
         <w:ind w:left="0" w:firstLine="709"/>
         <w:jc w:val="left"/>
       </w:pPr>
@@ -5089,6 +5090,7 @@
         <w:pStyle w:val="1"/>
         <w:keepNext/>
         <w:keepLines/>
+        <w:pageBreakBefore/>
         <w:widowControl/>
         <w:numPr>
           <w:ilvl w:val="0"/>
@@ -5097,7 +5099,7 @@
         <w:tabs>
           <w:tab w:val="left" w:pos="1055"/>
         </w:tabs>
-        <w:spacing w:lineRule="exact" w:line="360" w:before="0" w:after="360"/>
+        <w:spacing w:lineRule="exact" w:line="360" w:before="0" w:after="0"/>
         <w:ind w:left="0" w:firstLine="709"/>
         <w:jc w:val="left"/>
       </w:pPr>

</xml_diff>

<commit_message>
Adjust subsection spacing and figure pagination
</commit_message>
<xml_diff>
--- a/lab2/Юденко_Е.А._434701_Л2_ЖЦРПО.docx
+++ b/lab2/Юденко_Е.А._434701_Л2_ЖЦРПО.docx
@@ -700,7 +700,7 @@
       <w:r>
         <w:t>3.3 Fork репозитория</w:t>
         <w:tab/>
-        <w:t>7</w:t>
+        <w:t>6</w:t>
       </w:r>
     </w:p>
     <w:p>
@@ -1669,7 +1669,7 @@
         <w:tabs>
           <w:tab w:val="left" w:pos="1265"/>
         </w:tabs>
-        <w:spacing w:lineRule="exact" w:line="360" w:before="0" w:after="360"/>
+        <w:spacing w:lineRule="exact" w:line="360" w:before="240" w:after="120"/>
         <w:ind w:left="0" w:firstLine="709"/>
         <w:jc w:val="left"/>
       </w:pPr>
@@ -1870,7 +1870,7 @@
         <w:tabs>
           <w:tab w:val="left" w:pos="1265"/>
         </w:tabs>
-        <w:spacing w:lineRule="exact" w:line="360" w:before="0" w:after="360"/>
+        <w:spacing w:lineRule="exact" w:line="360" w:before="240" w:after="120"/>
         <w:ind w:left="0" w:firstLine="709"/>
         <w:jc w:val="left"/>
       </w:pPr>
@@ -2337,7 +2337,7 @@
         <w:tabs>
           <w:tab w:val="left" w:pos="1265"/>
         </w:tabs>
-        <w:spacing w:lineRule="exact" w:line="360" w:before="0" w:after="360"/>
+        <w:spacing w:lineRule="exact" w:line="360" w:before="240" w:after="120"/>
         <w:ind w:left="0" w:firstLine="709"/>
         <w:jc w:val="left"/>
       </w:pPr>
@@ -3201,7 +3201,7 @@
         <w:tabs>
           <w:tab w:val="left" w:pos="1265"/>
         </w:tabs>
-        <w:spacing w:lineRule="exact" w:line="360" w:before="0" w:after="360"/>
+        <w:spacing w:lineRule="exact" w:line="360" w:before="240" w:after="120"/>
         <w:ind w:left="0" w:firstLine="709"/>
         <w:jc w:val="left"/>
       </w:pPr>
@@ -3359,7 +3359,7 @@
         <w:tabs>
           <w:tab w:val="left" w:pos="1265"/>
         </w:tabs>
-        <w:spacing w:lineRule="exact" w:line="360" w:before="0" w:after="360"/>
+        <w:spacing w:lineRule="exact" w:line="360" w:before="240" w:after="120"/>
         <w:ind w:left="0" w:firstLine="709"/>
         <w:jc w:val="left"/>
       </w:pPr>
@@ -3953,7 +3953,7 @@
         <w:tabs>
           <w:tab w:val="left" w:pos="1265"/>
         </w:tabs>
-        <w:spacing w:before="0" w:lineRule="exact" w:line="360" w:after="360"/>
+        <w:spacing w:before="240" w:lineRule="exact" w:line="360" w:after="120"/>
         <w:ind w:left="0" w:firstLine="709"/>
         <w:jc w:val="left"/>
       </w:pPr>
@@ -3980,7 +3980,7 @@
     <w:p>
       <w:pPr>
         <w:pStyle w:val="a3"/>
-        <w:keepNext/>
+        <w:keepNext w:val="0"/>
         <w:widowControl/>
         <w:spacing w:lineRule="exact" w:line="360" w:before="0" w:after="0"/>
         <w:ind w:right="153" w:left="0" w:firstLine="709"/>
@@ -4153,7 +4153,7 @@
         <w:tabs>
           <w:tab w:val="left" w:pos="1265"/>
         </w:tabs>
-        <w:spacing w:lineRule="exact" w:line="360" w:before="0" w:after="360"/>
+        <w:spacing w:lineRule="exact" w:line="360" w:before="240" w:after="120"/>
         <w:ind w:left="0" w:firstLine="709"/>
         <w:jc w:val="left"/>
       </w:pPr>
@@ -4809,7 +4809,7 @@
         <w:tabs>
           <w:tab w:val="left" w:pos="1265"/>
         </w:tabs>
-        <w:spacing w:lineRule="exact" w:line="360" w:before="0" w:after="360"/>
+        <w:spacing w:lineRule="exact" w:line="360" w:before="240" w:after="120"/>
         <w:ind w:left="0" w:firstLine="709"/>
         <w:jc w:val="left"/>
       </w:pPr>
@@ -5177,7 +5177,7 @@
         <w:tabs>
           <w:tab w:val="left" w:pos="1335"/>
         </w:tabs>
-        <w:spacing w:lineRule="exact" w:line="360" w:before="0" w:after="360"/>
+        <w:spacing w:lineRule="exact" w:line="360" w:before="240" w:after="120"/>
         <w:ind w:left="0" w:firstLine="709"/>
         <w:jc w:val="left"/>
       </w:pPr>
@@ -5513,7 +5513,7 @@
         <w:tabs>
           <w:tab w:val="left" w:pos="1335"/>
         </w:tabs>
-        <w:spacing w:lineRule="exact" w:line="360" w:before="0" w:after="360"/>
+        <w:spacing w:lineRule="exact" w:line="360" w:before="240" w:after="120"/>
         <w:ind w:left="0" w:firstLine="709"/>
         <w:jc w:val="left"/>
       </w:pPr>
@@ -5632,7 +5632,7 @@
         <w:tabs>
           <w:tab w:val="left" w:pos="1335"/>
         </w:tabs>
-        <w:spacing w:lineRule="exact" w:line="360" w:before="0" w:after="360"/>
+        <w:spacing w:lineRule="exact" w:line="360" w:before="240" w:after="120"/>
         <w:ind w:left="0" w:firstLine="709"/>
         <w:jc w:val="left"/>
       </w:pPr>
@@ -5784,7 +5784,7 @@
         <w:tabs>
           <w:tab w:val="left" w:pos="1335"/>
         </w:tabs>
-        <w:spacing w:before="0" w:lineRule="exact" w:line="360" w:after="360"/>
+        <w:spacing w:before="240" w:lineRule="exact" w:line="360" w:after="120"/>
         <w:ind w:left="0" w:firstLine="709"/>
         <w:jc w:val="left"/>
       </w:pPr>
@@ -5826,7 +5826,7 @@
         <w:tabs>
           <w:tab w:val="left" w:pos="1336"/>
         </w:tabs>
-        <w:spacing w:lineRule="exact" w:line="360" w:before="0" w:after="360"/>
+        <w:spacing w:lineRule="exact" w:line="360" w:before="240" w:after="120"/>
         <w:ind w:left="0" w:right="1086" w:firstLine="709"/>
         <w:jc w:val="left"/>
       </w:pPr>

</xml_diff>